<commit_message>
Expand trigonometry formula guide
</commit_message>
<xml_diff>
--- a/treasures/ขุมทรัพย์ MathPrep - บทที่ 7 ฟังก์ชันตรีโกณมิติ.docx
+++ b/treasures/ขุมทรัพย์ MathPrep - บทที่ 7 ฟังก์ชันตรีโกณมิติ.docx
@@ -649,17 +649,101 @@
     <w:p>
       <w:pPr>
         <w:pStyle w:val="Heading2"/>
+      </w:pPr>
+      <w:r>
+        <w:t>6. สูตรผลบวกเป็นผลคูณ</w:t>
+      </w:r>
+    </w:p>
+    <w:p>
+      <w:pPr/>
+      <w:r>
+        <w:t>sin A+sin B=2sin((A+B)/2)cos((A−B)/2);  sin A−sin B=2cos((A+B)/2)sin((A−B)/2);  cos A+cos B=2cos((A+B)/2)cos((A−B)/2);  cos A−cos B=−2sin((A+B)/2)sin((A−B)/2)</w:t>
+      </w:r>
+    </w:p>
+    <w:p>
+      <w:pPr/>
+      <w:r>
+        <w:t>ความหมายของตัวแปร: A และ B เป็นมุม โดย (A+B)/2 คือมุมเฉลี่ย และ (A−B)/2 คือครึ่งผลต่าง</w:t>
+        <w:br/>
+        <w:t>เงื่อนไขการใช้: ทุกฟังก์ชันต้องนิยาม และควรจัดลำดับ A,B ให้สอดคล้องกับเครื่องหมาย</w:t>
+        <w:br/>
+        <w:t>ใช้กับโจทย์แบบไหน: แปลงผลบวกหรือผลต่างของ sin, cos ให้เป็นผลคูณ เพื่อแก้สมการหรือย่อรูป</w:t>
+        <w:br/>
+        <w:t>Keyword: sin A±sin B, cos A±cos B, ผลบวกเป็นผลคูณ</w:t>
+        <w:br/>
+        <w:t>จุดที่ต้องระวัง: สูตร cos A−cos B มีเครื่องหมายลบอยู่ด้านหน้า</w:t>
+        <w:br/>
+        <w:t>ข้อผิดพลาดที่ทำบ่อย: สลับ A−B เป็น B−A แล้วลืมเปลี่ยนเครื่องหมาย</w:t>
+      </w:r>
+    </w:p>
+    <w:p>
+      <w:pPr>
+        <w:pStyle w:val="Heading2"/>
+      </w:pPr>
+      <w:r>
+        <w:t>7. สูตรผลคูณเป็นผลบวก</w:t>
+      </w:r>
+    </w:p>
+    <w:p>
+      <w:pPr/>
+      <w:r>
+        <w:t>2sin A cos B=sin(A+B)+sin(A−B);  2cos A sin B=sin(A+B)−sin(A−B);  2cos A cos B=cos(A+B)+cos(A−B);  2sin A sin B=cos(A−B)−cos(A+B)</w:t>
+      </w:r>
+    </w:p>
+    <w:p>
+      <w:pPr/>
+      <w:r>
+        <w:t>ความหมายของตัวแปร: A และ B เป็นมุม โดยสูตรเปลี่ยนผลคูณของฟังก์ชันสองตัวเป็นผลบวกหรือผลต่าง</w:t>
+        <w:br/>
+        <w:t>เงื่อนไขการใช้: ทุกฟังก์ชันต้องนิยาม และถ้านิพจน์ไม่มีตัวคูณ 2 ให้หารผลลัพธ์ด้วย 2</w:t>
+        <w:br/>
+        <w:t>ใช้กับโจทย์แบบไหน: ย่อผลคูณ แปลงรูปก่อนอินทิเกรต หรือเชื่อมกับสูตรบวกและลบมุม</w:t>
+        <w:br/>
+        <w:t>Keyword: sin A cos B, cos A cos B, sin A sin B, ผลคูณเป็นผลบวก</w:t>
+        <w:br/>
+        <w:t>จุดที่ต้องระวัง: สูตร 2sin A sin B เริ่มด้วย cos(A−B) แล้วลบ cos(A+B)</w:t>
+        <w:br/>
+        <w:t>ข้อผิดพลาดที่ทำบ่อย: ลืมตัวคูณ 2 หรือสลับเครื่องหมายของสูตร sin A sin B</w:t>
+      </w:r>
+    </w:p>
+    <w:p>
+      <w:pPr>
+        <w:pStyle w:val="Heading2"/>
+      </w:pPr>
+      <w:r>
+        <w:t>8. ฟังก์ชันผกผันตรีโกณมิติ</w:t>
+      </w:r>
+    </w:p>
+    <w:p>
+      <w:pPr/>
+      <w:r>
+        <w:t>arcsin x=θ ⇔ sinθ=x;  |θ|≤π/2;  arccos x=θ ⇔ cosθ=x;  0≤θ≤π;  arctan x=θ ⇔ tanθ=x;  |θ|&lt;π/2</w:t>
+      </w:r>
+    </w:p>
+    <w:p>
+      <w:pPr/>
+      <w:r>
+        <w:t>ความหมายของตัวแปร: arcsin, arccos และ arctan คืนค่ามุมหลักเพียงมุมเดียวตามช่วงที่กำหนด</w:t>
+        <w:br/>
+        <w:t>เงื่อนไขการใช้: arcsin และ arccos ใช้เมื่อ −1≤x≤1 ส่วน arctan ใช้ได้กับจำนวนจริงทุกค่า</w:t>
+        <w:br/>
+        <w:t>ใช้กับโจทย์แบบไหน: หามุมจากค่าตรีโกณ เลือกมุมหลัก และเริ่มแก้สมการตรีโกณ</w:t>
+        <w:br/>
+        <w:t>Keyword: arc, inverse trig, sin⁻¹, cos⁻¹, tan⁻¹, ค่าหลัก</w:t>
+        <w:br/>
+        <w:t>จุดที่ต้องระวัง: sin⁻¹x หมายถึง arcsin x ไม่ใช่ 1/sin x และ arcsin(sinθ) อาจไม่เท่ากับ θ ถ้า θ อยู่นอกช่วงค่าหลัก</w:t>
+        <w:br/>
+        <w:t>ข้อผิดพลาดที่ทำบ่อย: กดเครื่องคิดเลขได้มุมหลักแล้วสรุปว่าเป็นคำตอบทั้งหมดของสมการ</w:t>
+      </w:r>
+    </w:p>
+    <w:p>
+      <w:pPr>
+        <w:pStyle w:val="Heading2"/>
         <w:keepNext/>
         <w:spacing w:before="180" w:after="40"/>
       </w:pPr>
       <w:r>
-        <w:rPr>
-          <w:rFonts w:ascii="Tahoma" w:hAnsi="Tahoma" w:eastAsia="Tahoma"/>
-          <w:b/>
-          <w:color w:val="102A63"/>
-          <w:sz w:val="26"/>
-        </w:rPr>
-        <w:t>6. คำตอบทั่วไป</w:t>
+        <w:t>9. คำตอบทั่วไป</w:t>
       </w:r>
     </w:p>
     <w:p>
@@ -707,13 +791,7 @@
         <w:spacing w:before="180" w:after="40"/>
       </w:pPr>
       <w:r>
-        <w:rPr>
-          <w:rFonts w:ascii="Tahoma" w:hAnsi="Tahoma" w:eastAsia="Tahoma"/>
-          <w:b/>
-          <w:color w:val="102A63"/>
-          <w:sz w:val="26"/>
-        </w:rPr>
-        <w:t>7. กฎไซน์</w:t>
+        <w:t>10. กฎไซน์</w:t>
       </w:r>
     </w:p>
     <w:p>
@@ -761,13 +839,7 @@
         <w:spacing w:before="180" w:after="40"/>
       </w:pPr>
       <w:r>
-        <w:rPr>
-          <w:rFonts w:ascii="Tahoma" w:hAnsi="Tahoma" w:eastAsia="Tahoma"/>
-          <w:b/>
-          <w:color w:val="102A63"/>
-          <w:sz w:val="26"/>
-        </w:rPr>
-        <w:t>8. กฎโคไซน์และพื้นที่</w:t>
+        <w:t>11. กฎโคไซน์และพื้นที่</w:t>
       </w:r>
     </w:p>
     <w:p>
@@ -2007,11 +2079,7 @@
     </w:p>
     <w:p>
       <w:r>
-        <w:rPr>
-          <w:rFonts w:ascii="Tahoma" w:hAnsi="Tahoma" w:eastAsia="Tahoma"/>
-          <w:sz w:val="20"/>
-        </w:rPr>
-        <w:t>สูตรผลคูณเป็นผลบวกใช้เมื่อจำเป็น แต่เริ่มจากสูตรบวกมุมเพื่อหลีกเลี่ยงการท่องแยก</w:t>
+        <w:t>สูตรผลบวกเป็นผลคูณและผลคูณเป็นผลบวกควรเข้าใจจากสูตรบวกมุม แล้วเลือกใช้เมื่อช่วยย่อรูปหรือแก้สมการได้ตรงกว่า</w:t>
       </w:r>
     </w:p>
     <w:p>

</xml_diff>